<commit_message>
feat: Update admin site configuration and enhance DFD rendering for improved clarity and layout
</commit_message>
<xml_diff>
--- a/docs/CodeLogic_DFD_v3.docx
+++ b/docs/CodeLogic_DFD_v3.docx
@@ -197,7 +197,7 @@
       <w:r>
         <w:drawing>
           <wp:inline xmlns:a="http://schemas.openxmlformats.org/drawingml/2006/main" xmlns:pic="http://schemas.openxmlformats.org/drawingml/2006/picture">
-            <wp:extent cx="4138863" cy="7863840"/>
+            <wp:extent cx="4562637" cy="7863840"/>
             <wp:docPr id="3" name="Picture 3"/>
             <wp:cNvGraphicFramePr>
               <a:graphicFrameLocks noChangeAspect="1"/>
@@ -218,7 +218,7 @@
                   <pic:spPr>
                     <a:xfrm>
                       <a:off x="0" y="0"/>
-                      <a:ext cx="4138863" cy="7863840"/>
+                      <a:ext cx="4562637" cy="7863840"/>
                     </a:xfrm>
                     <a:prstGeom prst="rect"/>
                   </pic:spPr>
@@ -288,7 +288,7 @@
       <w:r>
         <w:drawing>
           <wp:inline xmlns:a="http://schemas.openxmlformats.org/drawingml/2006/main" xmlns:pic="http://schemas.openxmlformats.org/drawingml/2006/picture">
-            <wp:extent cx="6049107" cy="7863840"/>
+            <wp:extent cx="6858000" cy="7543800"/>
             <wp:docPr id="4" name="Picture 4"/>
             <wp:cNvGraphicFramePr>
               <a:graphicFrameLocks noChangeAspect="1"/>
@@ -309,7 +309,7 @@
                   <pic:spPr>
                     <a:xfrm>
                       <a:off x="0" y="0"/>
-                      <a:ext cx="6049107" cy="7863840"/>
+                      <a:ext cx="6858000" cy="7543800"/>
                     </a:xfrm>
                     <a:prstGeom prst="rect"/>
                   </pic:spPr>
@@ -379,7 +379,7 @@
       <w:r>
         <w:drawing>
           <wp:inline xmlns:a="http://schemas.openxmlformats.org/drawingml/2006/main" xmlns:pic="http://schemas.openxmlformats.org/drawingml/2006/picture">
-            <wp:extent cx="6858000" cy="6172200"/>
+            <wp:extent cx="6427176" cy="7863840"/>
             <wp:docPr id="5" name="Picture 5"/>
             <wp:cNvGraphicFramePr>
               <a:graphicFrameLocks noChangeAspect="1"/>
@@ -400,7 +400,7 @@
                   <pic:spPr>
                     <a:xfrm>
                       <a:off x="0" y="0"/>
-                      <a:ext cx="6858000" cy="6172200"/>
+                      <a:ext cx="6427176" cy="7863840"/>
                     </a:xfrm>
                     <a:prstGeom prst="rect"/>
                   </pic:spPr>
@@ -470,7 +470,7 @@
       <w:r>
         <w:drawing>
           <wp:inline xmlns:a="http://schemas.openxmlformats.org/drawingml/2006/main" xmlns:pic="http://schemas.openxmlformats.org/drawingml/2006/picture">
-            <wp:extent cx="5242560" cy="7863840"/>
+            <wp:extent cx="6585481" cy="7863840"/>
             <wp:docPr id="6" name="Picture 6"/>
             <wp:cNvGraphicFramePr>
               <a:graphicFrameLocks noChangeAspect="1"/>
@@ -491,7 +491,7 @@
                   <pic:spPr>
                     <a:xfrm>
                       <a:off x="0" y="0"/>
-                      <a:ext cx="5242560" cy="7863840"/>
+                      <a:ext cx="6585481" cy="7863840"/>
                     </a:xfrm>
                     <a:prstGeom prst="rect"/>
                   </pic:spPr>
@@ -561,7 +561,7 @@
       <w:r>
         <w:drawing>
           <wp:inline xmlns:a="http://schemas.openxmlformats.org/drawingml/2006/main" xmlns:pic="http://schemas.openxmlformats.org/drawingml/2006/picture">
-            <wp:extent cx="6858000" cy="6172200"/>
+            <wp:extent cx="6858000" cy="5567082"/>
             <wp:docPr id="7" name="Picture 7"/>
             <wp:cNvGraphicFramePr>
               <a:graphicFrameLocks noChangeAspect="1"/>
@@ -582,7 +582,7 @@
                   <pic:spPr>
                     <a:xfrm>
                       <a:off x="0" y="0"/>
-                      <a:ext cx="6858000" cy="6172200"/>
+                      <a:ext cx="6858000" cy="5567082"/>
                     </a:xfrm>
                     <a:prstGeom prst="rect"/>
                   </pic:spPr>
@@ -652,7 +652,7 @@
       <w:r>
         <w:drawing>
           <wp:inline xmlns:a="http://schemas.openxmlformats.org/drawingml/2006/main" xmlns:pic="http://schemas.openxmlformats.org/drawingml/2006/picture">
-            <wp:extent cx="6858000" cy="4800600"/>
+            <wp:extent cx="6858000" cy="3590364"/>
             <wp:docPr id="8" name="Picture 8"/>
             <wp:cNvGraphicFramePr>
               <a:graphicFrameLocks noChangeAspect="1"/>
@@ -673,7 +673,7 @@
                   <pic:spPr>
                     <a:xfrm>
                       <a:off x="0" y="0"/>
-                      <a:ext cx="6858000" cy="4800600"/>
+                      <a:ext cx="6858000" cy="3590364"/>
                     </a:xfrm>
                     <a:prstGeom prst="rect"/>
                   </pic:spPr>

</xml_diff>

<commit_message>
feat: Enhance leaderboard UI with dark-theme scrollbar and improve layout for player rankings
</commit_message>
<xml_diff>
--- a/docs/CodeLogic_DFD_v3.docx
+++ b/docs/CodeLogic_DFD_v3.docx
@@ -23,7 +23,7 @@
       <w:r>
         <w:drawing>
           <wp:inline xmlns:a="http://schemas.openxmlformats.org/drawingml/2006/main" xmlns:pic="http://schemas.openxmlformats.org/drawingml/2006/picture">
-            <wp:extent cx="8581292" cy="5577840"/>
+            <wp:extent cx="6858000" cy="4457700"/>
             <wp:docPr id="1" name="Picture 1"/>
             <wp:cNvGraphicFramePr>
               <a:graphicFrameLocks noChangeAspect="1"/>
@@ -44,7 +44,7 @@
                   <pic:spPr>
                     <a:xfrm>
                       <a:off x="0" y="0"/>
-                      <a:ext cx="8581292" cy="5577840"/>
+                      <a:ext cx="6858000" cy="4457700"/>
                     </a:xfrm>
                     <a:prstGeom prst="rect"/>
                   </pic:spPr>
@@ -63,27 +63,22 @@
         <w:rPr>
           <w:b/>
           <w:i/>
-          <w:sz w:val="22"/>
+          <w:sz w:val="20"/>
         </w:rPr>
         <w:t xml:space="preserve">Figure 1. </w:t>
       </w:r>
       <w:r>
         <w:rPr>
           <w:i/>
-          <w:sz w:val="22"/>
+          <w:sz w:val="20"/>
         </w:rPr>
-        <w:t>Level 0 Data Flow Diagram (Context Diagram) of the CodeLogic Quiz Platform showing the four external entities (Guest, Student, Admin, Email Service, PDF Service) and the high-level data flows into and out of the system.</w:t>
+        <w:t>Level 0 (Context) DFD of the CodeLogic Quiz Platform, showing the system as a single process with its five external entities and the main data flows between them.</w:t>
       </w:r>
     </w:p>
     <w:p>
-      <w:pPr>
-        <w:sectPr>
-          <w:pgSz w:w="15840" w:h="12240" w:orient="landscape"/>
-          <w:pgMar w:top="720" w:right="720" w:bottom="720" w:left="720" w:header="720" w:footer="720" w:gutter="0"/>
-          <w:cols w:space="720"/>
-          <w:docGrid w:linePitch="360"/>
-        </w:sectPr>
-      </w:pPr>
+      <w:r>
+        <w:br w:type="page"/>
+      </w:r>
     </w:p>
     <w:p>
       <w:pPr>
@@ -106,7 +101,7 @@
       <w:r>
         <w:drawing>
           <wp:inline xmlns:a="http://schemas.openxmlformats.org/drawingml/2006/main" xmlns:pic="http://schemas.openxmlformats.org/drawingml/2006/picture">
-            <wp:extent cx="6076603" cy="7863840"/>
+            <wp:extent cx="5935287" cy="7680960"/>
             <wp:docPr id="2" name="Picture 2"/>
             <wp:cNvGraphicFramePr>
               <a:graphicFrameLocks noChangeAspect="1"/>
@@ -127,7 +122,7 @@
                   <pic:spPr>
                     <a:xfrm>
                       <a:off x="0" y="0"/>
-                      <a:ext cx="6076603" cy="7863840"/>
+                      <a:ext cx="5935287" cy="7680960"/>
                     </a:xfrm>
                     <a:prstGeom prst="rect"/>
                   </pic:spPr>
@@ -146,16 +141,16 @@
         <w:rPr>
           <w:b/>
           <w:i/>
-          <w:sz w:val="22"/>
+          <w:sz w:val="20"/>
         </w:rPr>
         <w:t xml:space="preserve">Figure 2. </w:t>
       </w:r>
       <w:r>
         <w:rPr>
           <w:i/>
-          <w:sz w:val="22"/>
+          <w:sz w:val="20"/>
         </w:rPr>
-        <w:t>Level 1 Data Flow Diagram showing the six top-level processes of the CodeLogic platform (User &amp; Auth Management, Content Catalog, Quiz Engine, Progress &amp; Gamification, Certificate Management, and Learning Resources) and their primary data stores.</w:t>
+        <w:t>Level 1 DFD breaking the system into its six main processes and the data stores each one uses.</w:t>
       </w:r>
     </w:p>
     <w:p>
@@ -171,22 +166,9 @@
       <w:r>
         <w:rPr>
           <w:b/>
-          <w:sz w:val="36"/>
+          <w:sz w:val="32"/>
         </w:rPr>
-        <w:t>CodeLogic: Data Flow Diagram - Level 2</w:t>
-      </w:r>
-    </w:p>
-    <w:p>
-      <w:pPr>
-        <w:keepNext/>
-        <w:jc w:val="center"/>
-      </w:pPr>
-      <w:r>
-        <w:rPr>
-          <w:b/>
-          <w:sz w:val="26"/>
-        </w:rPr>
-        <w:t>Process 1.0 - User &amp; Auth Management</w:t>
+        <w:t>Level 2 DFD - Process 1.0 - User &amp; Auth Management</w:t>
       </w:r>
     </w:p>
     <w:p>
@@ -197,7 +179,7 @@
       <w:r>
         <w:drawing>
           <wp:inline xmlns:a="http://schemas.openxmlformats.org/drawingml/2006/main" xmlns:pic="http://schemas.openxmlformats.org/drawingml/2006/picture">
-            <wp:extent cx="4562637" cy="7863840"/>
+            <wp:extent cx="4456529" cy="7680960"/>
             <wp:docPr id="3" name="Picture 3"/>
             <wp:cNvGraphicFramePr>
               <a:graphicFrameLocks noChangeAspect="1"/>
@@ -218,7 +200,7 @@
                   <pic:spPr>
                     <a:xfrm>
                       <a:off x="0" y="0"/>
-                      <a:ext cx="4562637" cy="7863840"/>
+                      <a:ext cx="4456529" cy="7680960"/>
                     </a:xfrm>
                     <a:prstGeom prst="rect"/>
                   </pic:spPr>
@@ -237,16 +219,16 @@
         <w:rPr>
           <w:b/>
           <w:i/>
-          <w:sz w:val="22"/>
+          <w:sz w:val="20"/>
         </w:rPr>
         <w:t xml:space="preserve">Figure 3. </w:t>
       </w:r>
       <w:r>
         <w:rPr>
           <w:i/>
-          <w:sz w:val="22"/>
+          <w:sz w:val="20"/>
         </w:rPr>
-        <w:t>Level 2 decomposition of Process 1.0 (User &amp; Auth Management). Shows the nine sub-processes that handle registration, email verification, login with lockout, account unlock, password reset, logout, profile / avatar / password updates, and the post-login face-snapshot capture.</w:t>
+        <w:t>Level 2 DFD of Process 1.0, showing the sub-processes for sign up, email verification, login with lockout, password reset, logout, profile updates, and login-face capture.</w:t>
       </w:r>
     </w:p>
     <w:p>
@@ -262,22 +244,9 @@
       <w:r>
         <w:rPr>
           <w:b/>
-          <w:sz w:val="36"/>
+          <w:sz w:val="32"/>
         </w:rPr>
-        <w:t>CodeLogic: Data Flow Diagram - Level 2</w:t>
-      </w:r>
-    </w:p>
-    <w:p>
-      <w:pPr>
-        <w:keepNext/>
-        <w:jc w:val="center"/>
-      </w:pPr>
-      <w:r>
-        <w:rPr>
-          <w:b/>
-          <w:sz w:val="26"/>
-        </w:rPr>
-        <w:t>Process 2.0 - Content Catalog</w:t>
+        <w:t>Level 2 DFD - Process 2.0 - Content Catalog</w:t>
       </w:r>
     </w:p>
     <w:p>
@@ -328,16 +297,16 @@
         <w:rPr>
           <w:b/>
           <w:i/>
-          <w:sz w:val="22"/>
+          <w:sz w:val="20"/>
         </w:rPr>
         <w:t xml:space="preserve">Figure 4. </w:t>
       </w:r>
       <w:r>
         <w:rPr>
           <w:i/>
-          <w:sz w:val="22"/>
+          <w:sz w:val="20"/>
         </w:rPr>
-        <w:t>Level 2 decomposition of Process 2.0 (Content Catalog). Shows how guests and students browse categories, category details, and topic details (with per-user progress), and how admins manage categories, topics, questions, and lessons through the Django admin interface.</w:t>
+        <w:t>Level 2 DFD of Process 2.0, showing how guests and students browse categories and topics, and how admins manage the course content.</w:t>
       </w:r>
     </w:p>
     <w:p>
@@ -353,22 +322,9 @@
       <w:r>
         <w:rPr>
           <w:b/>
-          <w:sz w:val="36"/>
+          <w:sz w:val="32"/>
         </w:rPr>
-        <w:t>CodeLogic: Data Flow Diagram - Level 2</w:t>
-      </w:r>
-    </w:p>
-    <w:p>
-      <w:pPr>
-        <w:keepNext/>
-        <w:jc w:val="center"/>
-      </w:pPr>
-      <w:r>
-        <w:rPr>
-          <w:b/>
-          <w:sz w:val="26"/>
-        </w:rPr>
-        <w:t>Process 3.0 - Quiz Engine</w:t>
+        <w:t>Level 2 DFD - Process 3.0 - Quiz Engine</w:t>
       </w:r>
     </w:p>
     <w:p>
@@ -379,7 +335,7 @@
       <w:r>
         <w:drawing>
           <wp:inline xmlns:a="http://schemas.openxmlformats.org/drawingml/2006/main" xmlns:pic="http://schemas.openxmlformats.org/drawingml/2006/picture">
-            <wp:extent cx="6427176" cy="7863840"/>
+            <wp:extent cx="6277707" cy="7680960"/>
             <wp:docPr id="5" name="Picture 5"/>
             <wp:cNvGraphicFramePr>
               <a:graphicFrameLocks noChangeAspect="1"/>
@@ -400,7 +356,7 @@
                   <pic:spPr>
                     <a:xfrm>
                       <a:off x="0" y="0"/>
-                      <a:ext cx="6427176" cy="7863840"/>
+                      <a:ext cx="6277707" cy="7680960"/>
                     </a:xfrm>
                     <a:prstGeom prst="rect"/>
                   </pic:spPr>
@@ -419,16 +375,16 @@
         <w:rPr>
           <w:b/>
           <w:i/>
-          <w:sz w:val="22"/>
+          <w:sz w:val="20"/>
         </w:rPr>
         <w:t xml:space="preserve">Figure 5. </w:t>
       </w:r>
       <w:r>
         <w:rPr>
           <w:i/>
-          <w:sz w:val="22"/>
+          <w:sz w:val="20"/>
         </w:rPr>
-        <w:t>Level 2 decomposition of Process 3.0 (Quiz Engine). Shows the four sub-processes of the gameplay loop: starting an attempt (serving questions + lessons), validating and scoring each answer, handling the 30-second per-question timeout, and completing the quiz (final scoring + stars + XP).</w:t>
+        <w:t>Level 2 DFD of Process 3.0, showing the four steps of one quiz: start the attempt, score each answer, handle the 30-second timeout, and complete the quiz.</w:t>
       </w:r>
     </w:p>
     <w:p>
@@ -444,22 +400,9 @@
       <w:r>
         <w:rPr>
           <w:b/>
-          <w:sz w:val="36"/>
+          <w:sz w:val="32"/>
         </w:rPr>
-        <w:t>CodeLogic: Data Flow Diagram - Level 2</w:t>
-      </w:r>
-    </w:p>
-    <w:p>
-      <w:pPr>
-        <w:keepNext/>
-        <w:jc w:val="center"/>
-      </w:pPr>
-      <w:r>
-        <w:rPr>
-          <w:b/>
-          <w:sz w:val="26"/>
-        </w:rPr>
-        <w:t>Process 4.0 - Progress &amp; Gamification</w:t>
+        <w:t>Level 2 DFD - Process 4.0 - Progress &amp; Gamification</w:t>
       </w:r>
     </w:p>
     <w:p>
@@ -470,7 +413,7 @@
       <w:r>
         <w:drawing>
           <wp:inline xmlns:a="http://schemas.openxmlformats.org/drawingml/2006/main" xmlns:pic="http://schemas.openxmlformats.org/drawingml/2006/picture">
-            <wp:extent cx="6585481" cy="7863840"/>
+            <wp:extent cx="6432331" cy="7680960"/>
             <wp:docPr id="6" name="Picture 6"/>
             <wp:cNvGraphicFramePr>
               <a:graphicFrameLocks noChangeAspect="1"/>
@@ -491,7 +434,7 @@
                   <pic:spPr>
                     <a:xfrm>
                       <a:off x="0" y="0"/>
-                      <a:ext cx="6585481" cy="7863840"/>
+                      <a:ext cx="6432331" cy="7680960"/>
                     </a:xfrm>
                     <a:prstGeom prst="rect"/>
                   </pic:spPr>
@@ -510,16 +453,16 @@
         <w:rPr>
           <w:b/>
           <w:i/>
-          <w:sz w:val="22"/>
+          <w:sz w:val="20"/>
         </w:rPr>
         <w:t xml:space="preserve">Figure 6. </w:t>
       </w:r>
       <w:r>
         <w:rPr>
           <w:i/>
-          <w:sz w:val="22"/>
+          <w:sz w:val="20"/>
         </w:rPr>
-        <w:t>Level 2 decomposition of Process 4.0 (Progress &amp; Gamification). Shows how hearts regenerate over time, how XP is awarded with bonuses, how the daily streak is recomputed, how per-topic progress is bumped, and the three read-only dashboards (user stats, daily stats / challenges, and leaderboard).</w:t>
+        <w:t>Level 2 DFD of Process 4.0, showing how hearts regenerate, how XP and streaks are updated after a quiz, and the read-only stats and leaderboard screens.</w:t>
       </w:r>
     </w:p>
     <w:p>
@@ -535,22 +478,9 @@
       <w:r>
         <w:rPr>
           <w:b/>
-          <w:sz w:val="36"/>
+          <w:sz w:val="32"/>
         </w:rPr>
-        <w:t>CodeLogic: Data Flow Diagram - Level 2</w:t>
-      </w:r>
-    </w:p>
-    <w:p>
-      <w:pPr>
-        <w:keepNext/>
-        <w:jc w:val="center"/>
-      </w:pPr>
-      <w:r>
-        <w:rPr>
-          <w:b/>
-          <w:sz w:val="26"/>
-        </w:rPr>
-        <w:t>Process 5.0 - Certificate Management</w:t>
+        <w:t>Level 2 DFD - Process 5.0 - Certificate Management</w:t>
       </w:r>
     </w:p>
     <w:p>
@@ -601,16 +531,16 @@
         <w:rPr>
           <w:b/>
           <w:i/>
-          <w:sz w:val="22"/>
+          <w:sz w:val="20"/>
         </w:rPr>
         <w:t xml:space="preserve">Figure 7. </w:t>
       </w:r>
       <w:r>
         <w:rPr>
           <w:i/>
-          <w:sz w:val="22"/>
+          <w:sz w:val="20"/>
         </w:rPr>
-        <w:t>Level 2 decomposition of Process 5.0 (Certificate Management). Shows how a student's earned certificates are listed, how the certificate HTML is assembled, how it is rendered to PDF by either headless Chrome or WeasyPrint, and how admins can preview any user's certificate from the admin panel.</w:t>
+        <w:t>Level 2 DFD of Process 5.0, showing how earned certificates are listed, built as HTML, rendered to PDF, and previewed by admins.</w:t>
       </w:r>
     </w:p>
     <w:p>
@@ -626,22 +556,9 @@
       <w:r>
         <w:rPr>
           <w:b/>
-          <w:sz w:val="36"/>
+          <w:sz w:val="32"/>
         </w:rPr>
-        <w:t>CodeLogic: Data Flow Diagram - Level 2</w:t>
-      </w:r>
-    </w:p>
-    <w:p>
-      <w:pPr>
-        <w:keepNext/>
-        <w:jc w:val="center"/>
-      </w:pPr>
-      <w:r>
-        <w:rPr>
-          <w:b/>
-          <w:sz w:val="26"/>
-        </w:rPr>
-        <w:t>Process 6.0 - Learning Resources</w:t>
+        <w:t>Level 2 DFD - Process 6.0 - Learning Resources</w:t>
       </w:r>
     </w:p>
     <w:p>
@@ -692,20 +609,20 @@
         <w:rPr>
           <w:b/>
           <w:i/>
-          <w:sz w:val="22"/>
+          <w:sz w:val="20"/>
         </w:rPr>
         <w:t xml:space="preserve">Figure 8. </w:t>
       </w:r>
       <w:r>
         <w:rPr>
           <w:i/>
-          <w:sz w:val="22"/>
+          <w:sz w:val="20"/>
         </w:rPr>
-        <w:t>Level 2 decomposition of Process 6.0 (Learning Resources). Shows how guests and students browse, search, and filter the resource library, how a resource detail view increments its view counter, and how admins upload, edit, and remove resources.</w:t>
+        <w:t>Level 2 DFD of Process 6.0, showing how students search and view learning resources and how admins upload and edit them.</w:t>
       </w:r>
     </w:p>
     <w:sectPr>
-      <w:pgSz w:w="15840" w:h="12240"/>
+      <w:pgSz w:w="12240" w:h="15840"/>
       <w:pgMar w:top="720" w:right="720" w:bottom="720" w:left="720" w:header="720" w:footer="720" w:gutter="0"/>
       <w:cols w:space="720"/>
       <w:docGrid w:linePitch="360"/>

</xml_diff>